<commit_message>
Cambios Guión Sesión 1
</commit_message>
<xml_diff>
--- a/scripts/sesion01_guion_tomas.docx
+++ b/scripts/sesion01_guion_tomas.docx
@@ -607,7 +607,55 @@
                 <w:iCs/>
                 <w:color w:val="2C2C2A"/>
               </w:rPr>
-              <w:t>rtificial. Lleva semanas observándote: cuánto tiempo te quedas en cada video, qué pausas, cuándo deslizas rápido.</w:t>
+              <w:t xml:space="preserve">rtificial. Lleva semanas observándote: cuánto tiempo te quedas en cada video, </w:t>
+            </w:r>
+            <w:r>
+              <w:rPr>
+                <w:i/>
+                <w:iCs/>
+                <w:color w:val="2C2C2A"/>
+              </w:rPr>
+              <w:t xml:space="preserve">dónde haces </w:t>
+            </w:r>
+            <w:r>
+              <w:rPr>
+                <w:i/>
+                <w:iCs/>
+                <w:color w:val="2C2C2A"/>
+              </w:rPr>
+              <w:t>pausa</w:t>
+            </w:r>
+            <w:r>
+              <w:rPr>
+                <w:i/>
+                <w:iCs/>
+                <w:color w:val="2C2C2A"/>
+              </w:rPr>
+              <w:t xml:space="preserve"> y</w:t>
+            </w:r>
+            <w:r>
+              <w:rPr>
+                <w:i/>
+                <w:iCs/>
+                <w:color w:val="2C2C2A"/>
+              </w:rPr>
+              <w:t xml:space="preserve"> cuándo deslizas</w:t>
+            </w:r>
+            <w:r>
+              <w:rPr>
+                <w:i/>
+                <w:iCs/>
+                <w:color w:val="2C2C2A"/>
+              </w:rPr>
+              <w:t xml:space="preserve"> más</w:t>
+            </w:r>
+            <w:r>
+              <w:rPr>
+                <w:i/>
+                <w:iCs/>
+                <w:color w:val="2C2C2A"/>
+              </w:rPr>
+              <w:t xml:space="preserve"> rápido.</w:t>
             </w:r>
           </w:p>
           <w:p>
@@ -658,7 +706,39 @@
                 <w:iCs/>
                 <w:color w:val="2C2C2A"/>
               </w:rPr>
-              <w:t>Eso es lo que vamos a ver hoy. Empezamos con la pregunta más básica: ¿qué es la inteligencia artificial?</w:t>
+              <w:t xml:space="preserve">Eso es lo que vamos a ver hoy. Empezamos con la pregunta más básica: ¿qué es la </w:t>
+            </w:r>
+            <w:r>
+              <w:rPr>
+                <w:i/>
+                <w:iCs/>
+                <w:color w:val="2C2C2A"/>
+              </w:rPr>
+              <w:t>I</w:t>
+            </w:r>
+            <w:r>
+              <w:rPr>
+                <w:i/>
+                <w:iCs/>
+                <w:color w:val="2C2C2A"/>
+              </w:rPr>
+              <w:t xml:space="preserve">nteligencia </w:t>
+            </w:r>
+            <w:r>
+              <w:rPr>
+                <w:i/>
+                <w:iCs/>
+                <w:color w:val="2C2C2A"/>
+              </w:rPr>
+              <w:t>A</w:t>
+            </w:r>
+            <w:r>
+              <w:rPr>
+                <w:i/>
+                <w:iCs/>
+                <w:color w:val="2C2C2A"/>
+              </w:rPr>
+              <w:t>rtificial?</w:t>
             </w:r>
           </w:p>
         </w:tc>

</xml_diff>